<commit_message>
8practise calculator init patch
</commit_message>
<xml_diff>
--- a/Практическая работа 7 Классы Эквивалентности Таблицы.docx
+++ b/Практическая работа 7 Классы Эквивалентности Таблицы.docx
@@ -43,13 +43,15 @@
         <w:tblLook w:val="04A0" w:firstRow="1" w:lastRow="0" w:firstColumn="1" w:lastColumn="0" w:noHBand="0" w:noVBand="1"/>
       </w:tblPr>
       <w:tblGrid>
-        <w:gridCol w:w="4672"/>
-        <w:gridCol w:w="4673"/>
+        <w:gridCol w:w="1978"/>
+        <w:gridCol w:w="1633"/>
+        <w:gridCol w:w="3275"/>
+        <w:gridCol w:w="2459"/>
       </w:tblGrid>
       <w:tr>
         <w:tc>
           <w:tcPr>
-            <w:tcW w:w="4672" w:type="dxa"/>
+            <w:tcW w:w="1978" w:type="dxa"/>
           </w:tcPr>
           <w:p>
             <w:pPr>
@@ -72,7 +74,7 @@
         </w:tc>
         <w:tc>
           <w:tcPr>
-            <w:tcW w:w="4673" w:type="dxa"/>
+            <w:tcW w:w="1633" w:type="dxa"/>
           </w:tcPr>
           <w:p>
             <w:pPr>
@@ -89,15 +91,61 @@
                 <w:bCs/>
                 <w:lang w:val="ru-RU"/>
               </w:rPr>
+              <w:t>Номер теста</w:t>
+            </w:r>
+          </w:p>
+        </w:tc>
+        <w:tc>
+          <w:tcPr>
+            <w:tcW w:w="3275" w:type="dxa"/>
+          </w:tcPr>
+          <w:p>
+            <w:pPr>
+              <w:jc w:val="center"/>
+              <w:rPr>
+                <w:b/>
+                <w:bCs/>
+                <w:lang w:val="ru-RU"/>
+              </w:rPr>
+            </w:pPr>
+            <w:r>
+              <w:rPr>
+                <w:b/>
+                <w:bCs/>
+                <w:lang w:val="ru-RU"/>
+              </w:rPr>
               <w:t>Неправильные классы</w:t>
             </w:r>
           </w:p>
         </w:tc>
-      </w:tr>
-      <w:tr>
-        <w:tc>
-          <w:tcPr>
-            <w:tcW w:w="4672" w:type="dxa"/>
+        <w:tc>
+          <w:tcPr>
+            <w:tcW w:w="2459" w:type="dxa"/>
+          </w:tcPr>
+          <w:p>
+            <w:pPr>
+              <w:jc w:val="center"/>
+              <w:rPr>
+                <w:b/>
+                <w:bCs/>
+                <w:lang w:val="ru-RU"/>
+              </w:rPr>
+            </w:pPr>
+            <w:r>
+              <w:rPr>
+                <w:b/>
+                <w:bCs/>
+                <w:lang w:val="ru-RU"/>
+              </w:rPr>
+              <w:t>Номер теста</w:t>
+            </w:r>
+          </w:p>
+        </w:tc>
+      </w:tr>
+      <w:tr>
+        <w:tc>
+          <w:tcPr>
+            <w:tcW w:w="1978" w:type="dxa"/>
           </w:tcPr>
           <w:p>
             <w:pPr>
@@ -111,13 +159,6 @@
               </w:rPr>
               <w:t xml:space="preserve">Часы от 0 до 23, </w:t>
             </w:r>
-          </w:p>
-          <w:p>
-            <w:pPr>
-              <w:rPr>
-                <w:lang w:val="ru-RU"/>
-              </w:rPr>
-            </w:pPr>
             <w:r>
               <w:rPr>
                 <w:lang w:val="ru-RU"/>
@@ -134,7 +175,31 @@
         </w:tc>
         <w:tc>
           <w:tcPr>
-            <w:tcW w:w="4673" w:type="dxa"/>
+            <w:tcW w:w="1633" w:type="dxa"/>
+          </w:tcPr>
+          <w:p>
+            <w:pPr>
+              <w:rPr>
+                <w:lang w:val="ru-RU"/>
+              </w:rPr>
+            </w:pPr>
+            <w:r>
+              <w:rPr>
+                <w:lang w:val="ru-RU"/>
+              </w:rPr>
+              <w:t>1</w:t>
+            </w:r>
+            <w:r>
+              <w:rPr>
+                <w:lang w:val="ru-RU"/>
+              </w:rPr>
+              <w:t>, 3</w:t>
+            </w:r>
+          </w:p>
+        </w:tc>
+        <w:tc>
+          <w:tcPr>
+            <w:tcW w:w="3275" w:type="dxa"/>
           </w:tcPr>
           <w:p>
             <w:pPr>
@@ -150,11 +215,30 @@
             </w:r>
           </w:p>
         </w:tc>
-      </w:tr>
-      <w:tr>
-        <w:tc>
-          <w:tcPr>
-            <w:tcW w:w="4672" w:type="dxa"/>
+        <w:tc>
+          <w:tcPr>
+            <w:tcW w:w="2459" w:type="dxa"/>
+          </w:tcPr>
+          <w:p>
+            <w:pPr>
+              <w:rPr>
+                <w:lang w:val="ru-RU"/>
+              </w:rPr>
+            </w:pPr>
+            <w:r>
+              <w:rPr>
+                <w:lang w:val="ru-RU"/>
+              </w:rPr>
+              <w:t>8</w:t>
+            </w:r>
+          </w:p>
+        </w:tc>
+      </w:tr>
+      <w:tr>
+        <w:tc>
+          <w:tcPr>
+            <w:tcW w:w="3611" w:type="dxa"/>
+            <w:gridSpan w:val="2"/>
             <w:vMerge w:val="restart"/>
           </w:tcPr>
           <w:p>
@@ -167,7 +251,7 @@
         </w:tc>
         <w:tc>
           <w:tcPr>
-            <w:tcW w:w="4673" w:type="dxa"/>
+            <w:tcW w:w="3275" w:type="dxa"/>
           </w:tcPr>
           <w:p>
             <w:pPr>
@@ -183,11 +267,30 @@
             </w:r>
           </w:p>
         </w:tc>
-      </w:tr>
-      <w:tr>
-        <w:tc>
-          <w:tcPr>
-            <w:tcW w:w="4672" w:type="dxa"/>
+        <w:tc>
+          <w:tcPr>
+            <w:tcW w:w="2459" w:type="dxa"/>
+          </w:tcPr>
+          <w:p>
+            <w:pPr>
+              <w:rPr>
+                <w:lang w:val="ru-RU"/>
+              </w:rPr>
+            </w:pPr>
+            <w:r>
+              <w:rPr>
+                <w:lang w:val="ru-RU"/>
+              </w:rPr>
+              <w:t>4</w:t>
+            </w:r>
+          </w:p>
+        </w:tc>
+      </w:tr>
+      <w:tr>
+        <w:tc>
+          <w:tcPr>
+            <w:tcW w:w="3611" w:type="dxa"/>
+            <w:gridSpan w:val="2"/>
             <w:vMerge/>
           </w:tcPr>
           <w:p>
@@ -200,7 +303,7 @@
         </w:tc>
         <w:tc>
           <w:tcPr>
-            <w:tcW w:w="4673" w:type="dxa"/>
+            <w:tcW w:w="3275" w:type="dxa"/>
           </w:tcPr>
           <w:p>
             <w:pPr>
@@ -216,11 +319,30 @@
             </w:r>
           </w:p>
         </w:tc>
-      </w:tr>
-      <w:tr>
-        <w:tc>
-          <w:tcPr>
-            <w:tcW w:w="4672" w:type="dxa"/>
+        <w:tc>
+          <w:tcPr>
+            <w:tcW w:w="2459" w:type="dxa"/>
+          </w:tcPr>
+          <w:p>
+            <w:pPr>
+              <w:rPr>
+                <w:lang w:val="ru-RU"/>
+              </w:rPr>
+            </w:pPr>
+            <w:r>
+              <w:rPr>
+                <w:lang w:val="ru-RU"/>
+              </w:rPr>
+              <w:t>3</w:t>
+            </w:r>
+          </w:p>
+        </w:tc>
+      </w:tr>
+      <w:tr>
+        <w:tc>
+          <w:tcPr>
+            <w:tcW w:w="3611" w:type="dxa"/>
+            <w:gridSpan w:val="2"/>
             <w:vMerge/>
           </w:tcPr>
           <w:p>
@@ -233,7 +355,7 @@
         </w:tc>
         <w:tc>
           <w:tcPr>
-            <w:tcW w:w="4673" w:type="dxa"/>
+            <w:tcW w:w="3275" w:type="dxa"/>
           </w:tcPr>
           <w:p>
             <w:pPr>
@@ -249,11 +371,30 @@
             </w:r>
           </w:p>
         </w:tc>
-      </w:tr>
-      <w:tr>
-        <w:tc>
-          <w:tcPr>
-            <w:tcW w:w="4672" w:type="dxa"/>
+        <w:tc>
+          <w:tcPr>
+            <w:tcW w:w="2459" w:type="dxa"/>
+          </w:tcPr>
+          <w:p>
+            <w:pPr>
+              <w:rPr>
+                <w:lang w:val="ru-RU"/>
+              </w:rPr>
+            </w:pPr>
+            <w:r>
+              <w:rPr>
+                <w:lang w:val="ru-RU"/>
+              </w:rPr>
+              <w:t>5</w:t>
+            </w:r>
+          </w:p>
+        </w:tc>
+      </w:tr>
+      <w:tr>
+        <w:tc>
+          <w:tcPr>
+            <w:tcW w:w="3611" w:type="dxa"/>
+            <w:gridSpan w:val="2"/>
             <w:vMerge/>
           </w:tcPr>
           <w:p>
@@ -266,7 +407,7 @@
         </w:tc>
         <w:tc>
           <w:tcPr>
-            <w:tcW w:w="4673" w:type="dxa"/>
+            <w:tcW w:w="3275" w:type="dxa"/>
           </w:tcPr>
           <w:p>
             <w:pPr>
@@ -282,11 +423,30 @@
             </w:r>
           </w:p>
         </w:tc>
-      </w:tr>
-      <w:tr>
-        <w:tc>
-          <w:tcPr>
-            <w:tcW w:w="4672" w:type="dxa"/>
+        <w:tc>
+          <w:tcPr>
+            <w:tcW w:w="2459" w:type="dxa"/>
+          </w:tcPr>
+          <w:p>
+            <w:pPr>
+              <w:rPr>
+                <w:lang w:val="ru-RU"/>
+              </w:rPr>
+            </w:pPr>
+            <w:r>
+              <w:rPr>
+                <w:lang w:val="ru-RU"/>
+              </w:rPr>
+              <w:t>5</w:t>
+            </w:r>
+          </w:p>
+        </w:tc>
+      </w:tr>
+      <w:tr>
+        <w:tc>
+          <w:tcPr>
+            <w:tcW w:w="3611" w:type="dxa"/>
+            <w:gridSpan w:val="2"/>
             <w:vMerge/>
           </w:tcPr>
           <w:p>
@@ -299,7 +459,7 @@
         </w:tc>
         <w:tc>
           <w:tcPr>
-            <w:tcW w:w="4673" w:type="dxa"/>
+            <w:tcW w:w="3275" w:type="dxa"/>
           </w:tcPr>
           <w:p>
             <w:pPr>
@@ -315,11 +475,30 @@
             </w:r>
           </w:p>
         </w:tc>
-      </w:tr>
-      <w:tr>
-        <w:tc>
-          <w:tcPr>
-            <w:tcW w:w="4672" w:type="dxa"/>
+        <w:tc>
+          <w:tcPr>
+            <w:tcW w:w="2459" w:type="dxa"/>
+          </w:tcPr>
+          <w:p>
+            <w:pPr>
+              <w:rPr>
+                <w:lang w:val="ru-RU"/>
+              </w:rPr>
+            </w:pPr>
+            <w:r>
+              <w:rPr>
+                <w:lang w:val="ru-RU"/>
+              </w:rPr>
+              <w:t>9</w:t>
+            </w:r>
+          </w:p>
+        </w:tc>
+      </w:tr>
+      <w:tr>
+        <w:tc>
+          <w:tcPr>
+            <w:tcW w:w="3611" w:type="dxa"/>
+            <w:gridSpan w:val="2"/>
             <w:vMerge/>
           </w:tcPr>
           <w:p>
@@ -332,7 +511,7 @@
         </w:tc>
         <w:tc>
           <w:tcPr>
-            <w:tcW w:w="4673" w:type="dxa"/>
+            <w:tcW w:w="3275" w:type="dxa"/>
           </w:tcPr>
           <w:p>
             <w:pPr>
@@ -348,36 +527,21 @@
             </w:r>
           </w:p>
         </w:tc>
-      </w:tr>
-      <w:tr>
-        <w:tc>
-          <w:tcPr>
-            <w:tcW w:w="4672" w:type="dxa"/>
-            <w:vMerge/>
-          </w:tcPr>
-          <w:p>
-            <w:pPr>
-              <w:rPr>
-                <w:lang w:val="ru-RU"/>
-              </w:rPr>
-            </w:pPr>
-          </w:p>
-        </w:tc>
-        <w:tc>
-          <w:tcPr>
-            <w:tcW w:w="4673" w:type="dxa"/>
-          </w:tcPr>
-          <w:p>
-            <w:pPr>
-              <w:rPr>
-                <w:lang w:val="ru-RU"/>
-              </w:rPr>
-            </w:pPr>
-            <w:r>
-              <w:rPr>
-                <w:lang w:val="ru-RU"/>
-              </w:rPr>
-              <w:t>Некорректные символы вместо цифр (например, "ab:cd")</w:t>
+        <w:tc>
+          <w:tcPr>
+            <w:tcW w:w="2459" w:type="dxa"/>
+          </w:tcPr>
+          <w:p>
+            <w:pPr>
+              <w:rPr>
+                <w:lang w:val="ru-RU"/>
+              </w:rPr>
+            </w:pPr>
+            <w:r>
+              <w:rPr>
+                <w:lang w:val="ru-RU"/>
+              </w:rPr>
+              <w:t>7</w:t>
             </w:r>
           </w:p>
         </w:tc>
@@ -422,388 +586,17 @@
         </w:rPr>
         <w:t>1</w:t>
       </w:r>
-    </w:p>
-    <w:tbl>
-      <w:tblPr>
-        <w:tblStyle w:val="TableGrid"/>
-        <w:tblW w:w="0" w:type="auto"/>
-        <w:tblLook w:val="04A0" w:firstRow="1" w:lastRow="0" w:firstColumn="1" w:lastColumn="0" w:noHBand="0" w:noVBand="1"/>
-      </w:tblPr>
-      <w:tblGrid>
-        <w:gridCol w:w="4672"/>
-        <w:gridCol w:w="4673"/>
-      </w:tblGrid>
-      <w:tr>
-        <w:tc>
-          <w:tcPr>
-            <w:tcW w:w="4672" w:type="dxa"/>
-          </w:tcPr>
-          <w:p>
-            <w:pPr>
-              <w:jc w:val="center"/>
-              <w:rPr>
-                <w:b/>
-                <w:bCs/>
-                <w:lang w:val="ru-RU"/>
-              </w:rPr>
-            </w:pPr>
-            <w:r>
-              <w:rPr>
-                <w:b/>
-                <w:bCs/>
-                <w:lang w:val="ru-RU"/>
-              </w:rPr>
-              <w:t>#</w:t>
-            </w:r>
-          </w:p>
-        </w:tc>
-        <w:tc>
-          <w:tcPr>
-            <w:tcW w:w="4673" w:type="dxa"/>
-          </w:tcPr>
-          <w:p>
-            <w:pPr>
-              <w:jc w:val="center"/>
-              <w:rPr>
-                <w:b/>
-                <w:bCs/>
-                <w:lang w:val="ru-RU"/>
-              </w:rPr>
-            </w:pPr>
-            <w:r>
-              <w:rPr>
-                <w:b/>
-                <w:bCs/>
-                <w:lang w:val="ru-RU"/>
-              </w:rPr>
-              <w:t>Порядковый номер</w:t>
-            </w:r>
-          </w:p>
-        </w:tc>
-      </w:tr>
-      <w:tr>
-        <w:tc>
-          <w:tcPr>
-            <w:tcW w:w="4672" w:type="dxa"/>
-          </w:tcPr>
-          <w:p>
-            <w:pPr>
-              <w:rPr>
-                <w:lang w:val="ru-RU"/>
-              </w:rPr>
-            </w:pPr>
-            <w:r>
-              <w:rPr>
-                <w:lang w:val="ru-RU"/>
-              </w:rPr>
-              <w:t>1</w:t>
-            </w:r>
-          </w:p>
-        </w:tc>
-        <w:tc>
-          <w:tcPr>
-            <w:tcW w:w="4673" w:type="dxa"/>
-          </w:tcPr>
-          <w:p>
-            <w:pPr>
-              <w:rPr>
-                <w:lang w:val="ru-RU"/>
-              </w:rPr>
-            </w:pPr>
-            <w:r>
-              <w:rPr>
-                <w:lang w:val="ru-RU"/>
-              </w:rPr>
-              <w:t>TC1</w:t>
-            </w:r>
-          </w:p>
-        </w:tc>
-      </w:tr>
-      <w:tr>
-        <w:tc>
-          <w:tcPr>
-            <w:tcW w:w="4672" w:type="dxa"/>
-          </w:tcPr>
-          <w:p>
-            <w:pPr>
-              <w:rPr>
-                <w:lang w:val="ru-RU"/>
-              </w:rPr>
-            </w:pPr>
-            <w:r>
-              <w:rPr>
-                <w:lang w:val="ru-RU"/>
-              </w:rPr>
-              <w:t>Название программы</w:t>
-            </w:r>
-          </w:p>
-        </w:tc>
-        <w:tc>
-          <w:tcPr>
-            <w:tcW w:w="4673" w:type="dxa"/>
-          </w:tcPr>
-          <w:p>
-            <w:pPr>
-              <w:rPr>
-                <w:lang w:val="ru-RU"/>
-              </w:rPr>
-            </w:pPr>
-            <w:r>
-              <w:rPr>
-                <w:lang w:val="ru-RU"/>
-              </w:rPr>
-              <w:t>Проверка формата времени "чч:мм"</w:t>
-            </w:r>
-          </w:p>
-        </w:tc>
-      </w:tr>
-      <w:tr>
-        <w:tc>
-          <w:tcPr>
-            <w:tcW w:w="4672" w:type="dxa"/>
-          </w:tcPr>
-          <w:p>
-            <w:pPr>
-              <w:rPr>
-                <w:lang w:val="ru-RU"/>
-              </w:rPr>
-            </w:pPr>
-            <w:r>
-              <w:rPr>
-                <w:lang w:val="ru-RU"/>
-              </w:rPr>
-              <w:t>Резюме тестирования</w:t>
-            </w:r>
-          </w:p>
-        </w:tc>
-        <w:tc>
-          <w:tcPr>
-            <w:tcW w:w="4673" w:type="dxa"/>
-          </w:tcPr>
-          <w:p>
-            <w:pPr>
-              <w:rPr>
-                <w:lang w:val="ru-RU"/>
-              </w:rPr>
-            </w:pPr>
-            <w:r>
-              <w:rPr>
-                <w:lang w:val="ru-RU"/>
-              </w:rPr>
-              <w:t>Валидный формат с ведущим нулём</w:t>
-            </w:r>
-          </w:p>
-        </w:tc>
-      </w:tr>
-      <w:tr>
-        <w:tc>
-          <w:tcPr>
-            <w:tcW w:w="4672" w:type="dxa"/>
-          </w:tcPr>
-          <w:p>
-            <w:pPr>
-              <w:rPr>
-                <w:lang w:val="ru-RU"/>
-              </w:rPr>
-            </w:pPr>
-            <w:r>
-              <w:rPr>
-                <w:lang w:val="ru-RU"/>
-              </w:rPr>
-              <w:t>Вид теста</w:t>
-            </w:r>
-          </w:p>
-        </w:tc>
-        <w:tc>
-          <w:tcPr>
-            <w:tcW w:w="4673" w:type="dxa"/>
-          </w:tcPr>
-          <w:p>
-            <w:pPr>
-              <w:rPr>
-                <w:lang w:val="ru-RU"/>
-              </w:rPr>
-            </w:pPr>
-            <w:r>
-              <w:rPr>
-                <w:lang w:val="ru-RU"/>
-              </w:rPr>
-              <w:t>позитивный</w:t>
-            </w:r>
-          </w:p>
-        </w:tc>
-      </w:tr>
-      <w:tr>
-        <w:tc>
-          <w:tcPr>
-            <w:tcW w:w="4672" w:type="dxa"/>
-          </w:tcPr>
-          <w:p>
-            <w:pPr>
-              <w:rPr>
-                <w:lang w:val="ru-RU"/>
-              </w:rPr>
-            </w:pPr>
-            <w:r>
-              <w:rPr>
-                <w:lang w:val="ru-RU"/>
-              </w:rPr>
-              <w:t>Тестовые данные</w:t>
-            </w:r>
-          </w:p>
-        </w:tc>
-        <w:tc>
-          <w:tcPr>
-            <w:tcW w:w="4673" w:type="dxa"/>
-          </w:tcPr>
-          <w:p>
-            <w:pPr>
-              <w:rPr>
-                <w:lang w:val="ru-RU"/>
-              </w:rPr>
-            </w:pPr>
-            <w:r>
-              <w:rPr>
-                <w:lang w:val="ru-RU"/>
-              </w:rPr>
-              <w:t>"09:30"</w:t>
-            </w:r>
-          </w:p>
-        </w:tc>
-      </w:tr>
-      <w:tr>
-        <w:tc>
-          <w:tcPr>
-            <w:tcW w:w="4672" w:type="dxa"/>
-          </w:tcPr>
-          <w:p>
-            <w:pPr>
-              <w:rPr>
-                <w:lang w:val="ru-RU"/>
-              </w:rPr>
-            </w:pPr>
-            <w:r>
-              <w:rPr>
-                <w:lang w:val="ru-RU"/>
-              </w:rPr>
-              <w:t>Ожидаемый результат</w:t>
-            </w:r>
-          </w:p>
-        </w:tc>
-        <w:tc>
-          <w:tcPr>
-            <w:tcW w:w="4673" w:type="dxa"/>
-          </w:tcPr>
-          <w:p>
-            <w:pPr>
-              <w:rPr>
-                <w:lang w:val="ru-RU"/>
-              </w:rPr>
-            </w:pPr>
-            <w:r>
-              <w:rPr>
-                <w:lang w:val="ru-RU"/>
-              </w:rPr>
-              <w:t>Время имеет корректный формат (ЧЧ:ММ): 09:30</w:t>
-            </w:r>
-          </w:p>
-        </w:tc>
-      </w:tr>
-      <w:tr>
-        <w:tc>
-          <w:tcPr>
-            <w:tcW w:w="4672" w:type="dxa"/>
-          </w:tcPr>
-          <w:p>
-            <w:pPr>
-              <w:rPr>
-                <w:lang w:val="ru-RU"/>
-              </w:rPr>
-            </w:pPr>
-            <w:r>
-              <w:rPr>
-                <w:lang w:val="ru-RU"/>
-              </w:rPr>
-              <w:t>Полученный результат</w:t>
-            </w:r>
-          </w:p>
-        </w:tc>
-        <w:tc>
-          <w:tcPr>
-            <w:tcW w:w="4673" w:type="dxa"/>
-          </w:tcPr>
-          <w:p>
-            <w:pPr>
-              <w:rPr>
-                <w:lang w:val="ru-RU"/>
-              </w:rPr>
-            </w:pPr>
-            <w:r>
-              <w:rPr>
-                <w:lang w:val="ru-RU"/>
-              </w:rPr>
-              <w:t>Время имеет корректный формат (ЧЧ:ММ): 09:30</w:t>
-            </w:r>
-          </w:p>
-        </w:tc>
-      </w:tr>
-      <w:tr>
-        <w:tc>
-          <w:tcPr>
-            <w:tcW w:w="4672" w:type="dxa"/>
-          </w:tcPr>
-          <w:p>
-            <w:pPr>
-              <w:rPr>
-                <w:lang w:val="ru-RU"/>
-              </w:rPr>
-            </w:pPr>
-            <w:r>
-              <w:rPr>
-                <w:lang w:val="ru-RU"/>
-              </w:rPr>
-              <w:t>Статус теста</w:t>
-            </w:r>
-          </w:p>
-        </w:tc>
-        <w:tc>
-          <w:tcPr>
-            <w:tcW w:w="4673" w:type="dxa"/>
-          </w:tcPr>
-          <w:p>
-            <w:pPr>
-              <w:rPr>
-                <w:lang w:val="ru-RU"/>
-              </w:rPr>
-            </w:pPr>
-            <w:r>
-              <w:rPr>
-                <w:lang w:val="ru-RU"/>
-              </w:rPr>
-              <w:t>П</w:t>
-            </w:r>
-            <w:r>
-              <w:rPr>
-                <w:lang w:val="ru-RU"/>
-              </w:rPr>
-              <w:t>ройден</w:t>
-            </w:r>
-          </w:p>
-        </w:tc>
-      </w:tr>
-    </w:tbl>
-    <w:p>
-      <w:pPr>
-        <w:pStyle w:val="Heading3"/>
-        <w:rPr>
-          <w:lang w:val="ru-RU"/>
-        </w:rPr>
-      </w:pPr>
       <w:r>
         <w:rPr>
           <w:lang w:val="ru-RU"/>
         </w:rPr>
-        <w:t>2</w:t>
+        <w:t xml:space="preserve"> </w:t>
+      </w:r>
+      <w:r>
+        <w:rPr>
+          <w:lang w:val="ru-RU"/>
+        </w:rPr>
+        <w:t>"09:30"</w:t>
       </w:r>
     </w:p>
     <w:tbl>
@@ -823,12 +616,17 @@
           </w:tcPr>
           <w:p>
             <w:pPr>
-              <w:rPr>
-                <w:lang w:val="ru-RU"/>
-              </w:rPr>
-            </w:pPr>
-            <w:r>
-              <w:rPr>
+              <w:jc w:val="center"/>
+              <w:rPr>
+                <w:b/>
+                <w:bCs/>
+                <w:lang w:val="ru-RU"/>
+              </w:rPr>
+            </w:pPr>
+            <w:r>
+              <w:rPr>
+                <w:b/>
+                <w:bCs/>
                 <w:lang w:val="ru-RU"/>
               </w:rPr>
               <w:t>#</w:t>
@@ -841,12 +639,17 @@
           </w:tcPr>
           <w:p>
             <w:pPr>
-              <w:rPr>
-                <w:lang w:val="ru-RU"/>
-              </w:rPr>
-            </w:pPr>
-            <w:r>
-              <w:rPr>
+              <w:jc w:val="center"/>
+              <w:rPr>
+                <w:b/>
+                <w:bCs/>
+                <w:lang w:val="ru-RU"/>
+              </w:rPr>
+            </w:pPr>
+            <w:r>
+              <w:rPr>
+                <w:b/>
+                <w:bCs/>
                 <w:lang w:val="ru-RU"/>
               </w:rPr>
               <w:t>Порядковый номер</w:t>
@@ -869,25 +672,25 @@
               <w:rPr>
                 <w:lang w:val="ru-RU"/>
               </w:rPr>
-              <w:t>2</w:t>
-            </w:r>
-          </w:p>
-        </w:tc>
-        <w:tc>
-          <w:tcPr>
-            <w:tcW w:w="4673" w:type="dxa"/>
-          </w:tcPr>
-          <w:p>
-            <w:pPr>
-              <w:rPr>
-                <w:lang w:val="ru-RU"/>
-              </w:rPr>
-            </w:pPr>
-            <w:r>
-              <w:rPr>
-                <w:lang w:val="ru-RU"/>
-              </w:rPr>
-              <w:t>TC2</w:t>
+              <w:t>1</w:t>
+            </w:r>
+          </w:p>
+        </w:tc>
+        <w:tc>
+          <w:tcPr>
+            <w:tcW w:w="4673" w:type="dxa"/>
+          </w:tcPr>
+          <w:p>
+            <w:pPr>
+              <w:rPr>
+                <w:lang w:val="ru-RU"/>
+              </w:rPr>
+            </w:pPr>
+            <w:r>
+              <w:rPr>
+                <w:lang w:val="ru-RU"/>
+              </w:rPr>
+              <w:t>TC1</w:t>
             </w:r>
           </w:p>
         </w:tc>
@@ -963,7 +766,7 @@
               <w:rPr>
                 <w:lang w:val="ru-RU"/>
               </w:rPr>
-              <w:t>Валидный формат без ведущих нулей</w:t>
+              <w:t>Валидный формат с ведущим нулём</w:t>
             </w:r>
           </w:p>
         </w:tc>
@@ -1039,7 +842,7 @@
               <w:rPr>
                 <w:lang w:val="ru-RU"/>
               </w:rPr>
-              <w:t>"9:5"</w:t>
+              <w:t>"09:30"</w:t>
             </w:r>
           </w:p>
         </w:tc>
@@ -1077,19 +880,7 @@
               <w:rPr>
                 <w:lang w:val="ru-RU"/>
               </w:rPr>
-              <w:t xml:space="preserve">Время имеет </w:t>
-            </w:r>
-            <w:r>
-              <w:rPr>
-                <w:lang w:val="ru-RU"/>
-              </w:rPr>
-              <w:t>не</w:t>
-            </w:r>
-            <w:r>
-              <w:rPr>
-                <w:lang w:val="ru-RU"/>
-              </w:rPr>
-              <w:t>корректный формат (ЧЧ:ММ): 9:5</w:t>
+              <w:t>Время имеет корректный формат (ЧЧ:ММ): 09:30</w:t>
             </w:r>
           </w:p>
         </w:tc>
@@ -1127,19 +918,7 @@
               <w:rPr>
                 <w:lang w:val="ru-RU"/>
               </w:rPr>
-              <w:t xml:space="preserve">Время имеет </w:t>
-            </w:r>
-            <w:r>
-              <w:rPr>
-                <w:lang w:val="ru-RU"/>
-              </w:rPr>
-              <w:t>не</w:t>
-            </w:r>
-            <w:r>
-              <w:rPr>
-                <w:lang w:val="ru-RU"/>
-              </w:rPr>
-              <w:t>корректный формат (ЧЧ:ММ): 9:5</w:t>
+              <w:t>Время имеет корректный формат (ЧЧ:ММ): 09:30</w:t>
             </w:r>
           </w:p>
         </w:tc>
@@ -1202,6 +981,30 @@
         </w:rPr>
         <w:t>3</w:t>
       </w:r>
+      <w:r>
+        <w:rPr>
+          <w:lang w:val="ru-RU"/>
+        </w:rPr>
+        <w:t xml:space="preserve"> </w:t>
+      </w:r>
+      <w:r>
+        <w:rPr>
+          <w:lang w:val="ru-RU"/>
+        </w:rPr>
+        <w:t>"</w:t>
+      </w:r>
+      <w:r>
+        <w:rPr>
+          <w:lang w:val="ru-RU"/>
+        </w:rPr>
+        <w:t>10:-1</w:t>
+      </w:r>
+      <w:r>
+        <w:rPr>
+          <w:lang w:val="ru-RU"/>
+        </w:rPr>
+        <w:t>"</w:t>
+      </w:r>
     </w:p>
     <w:tbl>
       <w:tblPr>
@@ -1220,6 +1023,7 @@
           </w:tcPr>
           <w:p>
             <w:pPr>
+              <w:jc w:val="center"/>
               <w:rPr>
                 <w:b/>
                 <w:bCs/>
@@ -1242,6 +1046,7 @@
           </w:tcPr>
           <w:p>
             <w:pPr>
+              <w:jc w:val="center"/>
               <w:rPr>
                 <w:b/>
                 <w:bCs/>
@@ -1274,6 +1079,450 @@
               <w:rPr>
                 <w:lang w:val="ru-RU"/>
               </w:rPr>
+              <w:t>2</w:t>
+            </w:r>
+          </w:p>
+        </w:tc>
+        <w:tc>
+          <w:tcPr>
+            <w:tcW w:w="4673" w:type="dxa"/>
+          </w:tcPr>
+          <w:p>
+            <w:pPr>
+              <w:rPr>
+                <w:lang w:val="ru-RU"/>
+              </w:rPr>
+            </w:pPr>
+            <w:r>
+              <w:rPr>
+                <w:lang w:val="ru-RU"/>
+              </w:rPr>
+              <w:t>TC2</w:t>
+            </w:r>
+          </w:p>
+        </w:tc>
+      </w:tr>
+      <w:tr>
+        <w:tc>
+          <w:tcPr>
+            <w:tcW w:w="4672" w:type="dxa"/>
+          </w:tcPr>
+          <w:p>
+            <w:pPr>
+              <w:rPr>
+                <w:lang w:val="ru-RU"/>
+              </w:rPr>
+            </w:pPr>
+            <w:r>
+              <w:rPr>
+                <w:lang w:val="ru-RU"/>
+              </w:rPr>
+              <w:t>Название программы</w:t>
+            </w:r>
+          </w:p>
+        </w:tc>
+        <w:tc>
+          <w:tcPr>
+            <w:tcW w:w="4673" w:type="dxa"/>
+          </w:tcPr>
+          <w:p>
+            <w:pPr>
+              <w:rPr>
+                <w:lang w:val="ru-RU"/>
+              </w:rPr>
+            </w:pPr>
+            <w:r>
+              <w:rPr>
+                <w:lang w:val="ru-RU"/>
+              </w:rPr>
+              <w:t>Проверка формата времени "чч:мм"</w:t>
+            </w:r>
+          </w:p>
+        </w:tc>
+      </w:tr>
+      <w:tr>
+        <w:tc>
+          <w:tcPr>
+            <w:tcW w:w="4672" w:type="dxa"/>
+          </w:tcPr>
+          <w:p>
+            <w:pPr>
+              <w:rPr>
+                <w:lang w:val="ru-RU"/>
+              </w:rPr>
+            </w:pPr>
+            <w:r>
+              <w:rPr>
+                <w:lang w:val="ru-RU"/>
+              </w:rPr>
+              <w:t>Резюме тестирования</w:t>
+            </w:r>
+          </w:p>
+        </w:tc>
+        <w:tc>
+          <w:tcPr>
+            <w:tcW w:w="4673" w:type="dxa"/>
+          </w:tcPr>
+          <w:p>
+            <w:pPr>
+              <w:rPr>
+                <w:lang w:val="ru-RU"/>
+              </w:rPr>
+            </w:pPr>
+            <w:r>
+              <w:rPr>
+                <w:lang w:val="ru-RU"/>
+              </w:rPr>
+              <w:t>Отрицательное число минут</w:t>
+            </w:r>
+          </w:p>
+        </w:tc>
+      </w:tr>
+      <w:tr>
+        <w:tc>
+          <w:tcPr>
+            <w:tcW w:w="4672" w:type="dxa"/>
+          </w:tcPr>
+          <w:p>
+            <w:pPr>
+              <w:rPr>
+                <w:lang w:val="ru-RU"/>
+              </w:rPr>
+            </w:pPr>
+            <w:r>
+              <w:rPr>
+                <w:lang w:val="ru-RU"/>
+              </w:rPr>
+              <w:t>Вид теста</w:t>
+            </w:r>
+          </w:p>
+        </w:tc>
+        <w:tc>
+          <w:tcPr>
+            <w:tcW w:w="4673" w:type="dxa"/>
+          </w:tcPr>
+          <w:p>
+            <w:pPr>
+              <w:rPr>
+                <w:lang w:val="ru-RU"/>
+              </w:rPr>
+            </w:pPr>
+            <w:r>
+              <w:rPr>
+                <w:lang w:val="ru-RU"/>
+              </w:rPr>
+              <w:t>позитивный</w:t>
+            </w:r>
+          </w:p>
+        </w:tc>
+      </w:tr>
+      <w:tr>
+        <w:tc>
+          <w:tcPr>
+            <w:tcW w:w="4672" w:type="dxa"/>
+          </w:tcPr>
+          <w:p>
+            <w:pPr>
+              <w:rPr>
+                <w:lang w:val="ru-RU"/>
+              </w:rPr>
+            </w:pPr>
+            <w:r>
+              <w:rPr>
+                <w:lang w:val="ru-RU"/>
+              </w:rPr>
+              <w:t>Тестовые данные</w:t>
+            </w:r>
+          </w:p>
+        </w:tc>
+        <w:tc>
+          <w:tcPr>
+            <w:tcW w:w="4673" w:type="dxa"/>
+          </w:tcPr>
+          <w:p>
+            <w:pPr>
+              <w:rPr>
+                <w:lang w:val="ru-RU"/>
+              </w:rPr>
+            </w:pPr>
+            <w:r>
+              <w:rPr>
+                <w:lang w:val="ru-RU"/>
+              </w:rPr>
+              <w:t>"</w:t>
+            </w:r>
+            <w:r>
+              <w:rPr>
+                <w:lang w:val="ru-RU"/>
+              </w:rPr>
+              <w:t>10:-1</w:t>
+            </w:r>
+            <w:r>
+              <w:rPr>
+                <w:lang w:val="ru-RU"/>
+              </w:rPr>
+              <w:t>"</w:t>
+            </w:r>
+          </w:p>
+        </w:tc>
+      </w:tr>
+      <w:tr>
+        <w:tc>
+          <w:tcPr>
+            <w:tcW w:w="4672" w:type="dxa"/>
+          </w:tcPr>
+          <w:p>
+            <w:pPr>
+              <w:rPr>
+                <w:lang w:val="ru-RU"/>
+              </w:rPr>
+            </w:pPr>
+            <w:r>
+              <w:rPr>
+                <w:lang w:val="ru-RU"/>
+              </w:rPr>
+              <w:t>Ожидаемый результат</w:t>
+            </w:r>
+          </w:p>
+        </w:tc>
+        <w:tc>
+          <w:tcPr>
+            <w:tcW w:w="4673" w:type="dxa"/>
+          </w:tcPr>
+          <w:p>
+            <w:pPr>
+              <w:rPr>
+                <w:lang w:val="ru-RU"/>
+              </w:rPr>
+            </w:pPr>
+            <w:r>
+              <w:rPr>
+                <w:lang w:val="ru-RU"/>
+              </w:rPr>
+              <w:t xml:space="preserve">Время имеет </w:t>
+            </w:r>
+            <w:r>
+              <w:rPr>
+                <w:lang w:val="ru-RU"/>
+              </w:rPr>
+              <w:t>не</w:t>
+            </w:r>
+            <w:r>
+              <w:rPr>
+                <w:lang w:val="ru-RU"/>
+              </w:rPr>
+              <w:t xml:space="preserve">корректный формат (ЧЧ:ММ): </w:t>
+            </w:r>
+            <w:r>
+              <w:rPr>
+                <w:lang w:val="ru-RU"/>
+              </w:rPr>
+              <w:t>10:-1</w:t>
+            </w:r>
+          </w:p>
+        </w:tc>
+      </w:tr>
+      <w:tr>
+        <w:tc>
+          <w:tcPr>
+            <w:tcW w:w="4672" w:type="dxa"/>
+          </w:tcPr>
+          <w:p>
+            <w:pPr>
+              <w:rPr>
+                <w:lang w:val="ru-RU"/>
+              </w:rPr>
+            </w:pPr>
+            <w:r>
+              <w:rPr>
+                <w:lang w:val="ru-RU"/>
+              </w:rPr>
+              <w:t>Полученный результат</w:t>
+            </w:r>
+          </w:p>
+        </w:tc>
+        <w:tc>
+          <w:tcPr>
+            <w:tcW w:w="4673" w:type="dxa"/>
+          </w:tcPr>
+          <w:p>
+            <w:pPr>
+              <w:rPr>
+                <w:lang w:val="ru-RU"/>
+              </w:rPr>
+            </w:pPr>
+            <w:r>
+              <w:rPr>
+                <w:lang w:val="ru-RU"/>
+              </w:rPr>
+              <w:t xml:space="preserve">Время имеет </w:t>
+            </w:r>
+            <w:r>
+              <w:rPr>
+                <w:lang w:val="ru-RU"/>
+              </w:rPr>
+              <w:t>не</w:t>
+            </w:r>
+            <w:r>
+              <w:rPr>
+                <w:lang w:val="ru-RU"/>
+              </w:rPr>
+              <w:t xml:space="preserve">корректный формат (ЧЧ:ММ): </w:t>
+            </w:r>
+            <w:r>
+              <w:rPr>
+                <w:lang w:val="ru-RU"/>
+              </w:rPr>
+              <w:t>10:-1</w:t>
+            </w:r>
+          </w:p>
+        </w:tc>
+      </w:tr>
+      <w:tr>
+        <w:tc>
+          <w:tcPr>
+            <w:tcW w:w="4672" w:type="dxa"/>
+          </w:tcPr>
+          <w:p>
+            <w:pPr>
+              <w:rPr>
+                <w:lang w:val="ru-RU"/>
+              </w:rPr>
+            </w:pPr>
+            <w:r>
+              <w:rPr>
+                <w:lang w:val="ru-RU"/>
+              </w:rPr>
+              <w:lastRenderedPageBreak/>
+              <w:t>Статус теста</w:t>
+            </w:r>
+          </w:p>
+        </w:tc>
+        <w:tc>
+          <w:tcPr>
+            <w:tcW w:w="4673" w:type="dxa"/>
+          </w:tcPr>
+          <w:p>
+            <w:pPr>
+              <w:rPr>
+                <w:lang w:val="ru-RU"/>
+              </w:rPr>
+            </w:pPr>
+            <w:r>
+              <w:rPr>
+                <w:lang w:val="ru-RU"/>
+              </w:rPr>
+              <w:t>П</w:t>
+            </w:r>
+            <w:r>
+              <w:rPr>
+                <w:lang w:val="ru-RU"/>
+              </w:rPr>
+              <w:t>ройден</w:t>
+            </w:r>
+          </w:p>
+        </w:tc>
+      </w:tr>
+    </w:tbl>
+    <w:p>
+      <w:pPr>
+        <w:pStyle w:val="Heading3"/>
+        <w:rPr>
+          <w:lang w:val="ru-RU"/>
+        </w:rPr>
+      </w:pPr>
+      <w:r>
+        <w:rPr>
+          <w:lang w:val="ru-RU"/>
+        </w:rPr>
+        <w:t>3</w:t>
+      </w:r>
+      <w:r>
+        <w:rPr>
+          <w:lang w:val="ru-RU"/>
+        </w:rPr>
+        <w:t xml:space="preserve"> </w:t>
+      </w:r>
+      <w:r>
+        <w:rPr>
+          <w:lang w:val="ru-RU"/>
+        </w:rPr>
+        <w:t>"23:59"</w:t>
+      </w:r>
+    </w:p>
+    <w:tbl>
+      <w:tblPr>
+        <w:tblStyle w:val="TableGrid"/>
+        <w:tblW w:w="0" w:type="auto"/>
+        <w:tblLook w:val="04A0" w:firstRow="1" w:lastRow="0" w:firstColumn="1" w:lastColumn="0" w:noHBand="0" w:noVBand="1"/>
+      </w:tblPr>
+      <w:tblGrid>
+        <w:gridCol w:w="4672"/>
+        <w:gridCol w:w="4673"/>
+      </w:tblGrid>
+      <w:tr>
+        <w:tc>
+          <w:tcPr>
+            <w:tcW w:w="4672" w:type="dxa"/>
+          </w:tcPr>
+          <w:p>
+            <w:pPr>
+              <w:jc w:val="center"/>
+              <w:rPr>
+                <w:b/>
+                <w:bCs/>
+                <w:lang w:val="ru-RU"/>
+              </w:rPr>
+            </w:pPr>
+            <w:r>
+              <w:rPr>
+                <w:b/>
+                <w:bCs/>
+                <w:lang w:val="ru-RU"/>
+              </w:rPr>
+              <w:t>#</w:t>
+            </w:r>
+          </w:p>
+        </w:tc>
+        <w:tc>
+          <w:tcPr>
+            <w:tcW w:w="4673" w:type="dxa"/>
+          </w:tcPr>
+          <w:p>
+            <w:pPr>
+              <w:jc w:val="center"/>
+              <w:rPr>
+                <w:b/>
+                <w:bCs/>
+                <w:lang w:val="ru-RU"/>
+              </w:rPr>
+            </w:pPr>
+            <w:r>
+              <w:rPr>
+                <w:b/>
+                <w:bCs/>
+                <w:lang w:val="ru-RU"/>
+              </w:rPr>
+              <w:t>Порядковый номер</w:t>
+            </w:r>
+          </w:p>
+        </w:tc>
+      </w:tr>
+      <w:tr>
+        <w:tc>
+          <w:tcPr>
+            <w:tcW w:w="4672" w:type="dxa"/>
+          </w:tcPr>
+          <w:p>
+            <w:pPr>
+              <w:rPr>
+                <w:lang w:val="ru-RU"/>
+              </w:rPr>
+            </w:pPr>
+            <w:r>
+              <w:rPr>
+                <w:lang w:val="ru-RU"/>
+              </w:rPr>
               <w:t>3</w:t>
             </w:r>
           </w:p>
@@ -1312,7 +1561,6 @@
               <w:rPr>
                 <w:lang w:val="ru-RU"/>
               </w:rPr>
-              <w:lastRenderedPageBreak/>
               <w:t>Название программы</w:t>
             </w:r>
           </w:p>
@@ -1584,6 +1832,18 @@
         </w:rPr>
         <w:t>4</w:t>
       </w:r>
+      <w:r>
+        <w:rPr>
+          <w:lang w:val="ru-RU"/>
+        </w:rPr>
+        <w:t xml:space="preserve"> </w:t>
+      </w:r>
+      <w:r>
+        <w:rPr>
+          <w:lang w:val="ru-RU"/>
+        </w:rPr>
+        <w:t>"24:00"</w:t>
+      </w:r>
     </w:p>
     <w:tbl>
       <w:tblPr>
@@ -1602,12 +1862,17 @@
           </w:tcPr>
           <w:p>
             <w:pPr>
-              <w:rPr>
-                <w:lang w:val="ru-RU"/>
-              </w:rPr>
-            </w:pPr>
-            <w:r>
-              <w:rPr>
+              <w:jc w:val="center"/>
+              <w:rPr>
+                <w:b/>
+                <w:bCs/>
+                <w:lang w:val="ru-RU"/>
+              </w:rPr>
+            </w:pPr>
+            <w:r>
+              <w:rPr>
+                <w:b/>
+                <w:bCs/>
                 <w:lang w:val="ru-RU"/>
               </w:rPr>
               <w:t>#</w:t>
@@ -1620,12 +1885,17 @@
           </w:tcPr>
           <w:p>
             <w:pPr>
-              <w:rPr>
-                <w:lang w:val="ru-RU"/>
-              </w:rPr>
-            </w:pPr>
-            <w:r>
-              <w:rPr>
+              <w:jc w:val="center"/>
+              <w:rPr>
+                <w:b/>
+                <w:bCs/>
+                <w:lang w:val="ru-RU"/>
+              </w:rPr>
+            </w:pPr>
+            <w:r>
+              <w:rPr>
+                <w:b/>
+                <w:bCs/>
                 <w:lang w:val="ru-RU"/>
               </w:rPr>
               <w:t>Порядковый номер</w:t>
@@ -1957,6 +2227,18 @@
         </w:rPr>
         <w:t>5</w:t>
       </w:r>
+      <w:r>
+        <w:rPr>
+          <w:lang w:val="ru-RU"/>
+        </w:rPr>
+        <w:t xml:space="preserve"> </w:t>
+      </w:r>
+      <w:r>
+        <w:rPr>
+          <w:lang w:val="ru-RU"/>
+        </w:rPr>
+        <w:t>"10:60"</w:t>
+      </w:r>
     </w:p>
     <w:tbl>
       <w:tblPr>
@@ -1975,12 +2257,17 @@
           </w:tcPr>
           <w:p>
             <w:pPr>
-              <w:rPr>
-                <w:lang w:val="ru-RU"/>
-              </w:rPr>
-            </w:pPr>
-            <w:r>
-              <w:rPr>
+              <w:jc w:val="center"/>
+              <w:rPr>
+                <w:b/>
+                <w:bCs/>
+                <w:lang w:val="ru-RU"/>
+              </w:rPr>
+            </w:pPr>
+            <w:r>
+              <w:rPr>
+                <w:b/>
+                <w:bCs/>
                 <w:lang w:val="ru-RU"/>
               </w:rPr>
               <w:t>#</w:t>
@@ -1993,12 +2280,17 @@
           </w:tcPr>
           <w:p>
             <w:pPr>
-              <w:rPr>
-                <w:lang w:val="ru-RU"/>
-              </w:rPr>
-            </w:pPr>
-            <w:r>
-              <w:rPr>
+              <w:jc w:val="center"/>
+              <w:rPr>
+                <w:b/>
+                <w:bCs/>
+                <w:lang w:val="ru-RU"/>
+              </w:rPr>
+            </w:pPr>
+            <w:r>
+              <w:rPr>
+                <w:b/>
+                <w:bCs/>
                 <w:lang w:val="ru-RU"/>
               </w:rPr>
               <w:t>Порядковый номер</w:t>
@@ -2330,6 +2622,18 @@
         </w:rPr>
         <w:t>6</w:t>
       </w:r>
+      <w:r>
+        <w:rPr>
+          <w:lang w:val="ru-RU"/>
+        </w:rPr>
+        <w:t xml:space="preserve"> </w:t>
+      </w:r>
+      <w:r>
+        <w:rPr>
+          <w:lang w:val="ru-RU"/>
+        </w:rPr>
+        <w:t>"1030"</w:t>
+      </w:r>
     </w:p>
     <w:tbl>
       <w:tblPr>
@@ -2348,12 +2652,17 @@
           </w:tcPr>
           <w:p>
             <w:pPr>
-              <w:rPr>
-                <w:lang w:val="ru-RU"/>
-              </w:rPr>
-            </w:pPr>
-            <w:r>
-              <w:rPr>
+              <w:jc w:val="center"/>
+              <w:rPr>
+                <w:b/>
+                <w:bCs/>
+                <w:lang w:val="ru-RU"/>
+              </w:rPr>
+            </w:pPr>
+            <w:r>
+              <w:rPr>
+                <w:b/>
+                <w:bCs/>
                 <w:lang w:val="ru-RU"/>
               </w:rPr>
               <w:t>#</w:t>
@@ -2366,12 +2675,17 @@
           </w:tcPr>
           <w:p>
             <w:pPr>
-              <w:rPr>
-                <w:lang w:val="ru-RU"/>
-              </w:rPr>
-            </w:pPr>
-            <w:r>
-              <w:rPr>
+              <w:jc w:val="center"/>
+              <w:rPr>
+                <w:b/>
+                <w:bCs/>
+                <w:lang w:val="ru-RU"/>
+              </w:rPr>
+            </w:pPr>
+            <w:r>
+              <w:rPr>
+                <w:b/>
+                <w:bCs/>
                 <w:lang w:val="ru-RU"/>
               </w:rPr>
               <w:t>Порядковый номер</w:t>
@@ -2622,6 +2936,7 @@
               <w:rPr>
                 <w:lang w:val="ru-RU"/>
               </w:rPr>
+              <w:lastRenderedPageBreak/>
               <w:t>Полученный результат</w:t>
             </w:r>
           </w:p>
@@ -2701,8 +3016,19 @@
         <w:rPr>
           <w:lang w:val="ru-RU"/>
         </w:rPr>
-        <w:lastRenderedPageBreak/>
         <w:t>7</w:t>
+      </w:r>
+      <w:r>
+        <w:rPr>
+          <w:lang w:val="ru-RU"/>
+        </w:rPr>
+        <w:t xml:space="preserve"> </w:t>
+      </w:r>
+      <w:r>
+        <w:rPr>
+          <w:lang w:val="ru-RU"/>
+        </w:rPr>
+        <w:t>""</w:t>
       </w:r>
     </w:p>
     <w:tbl>
@@ -2722,12 +3048,17 @@
           </w:tcPr>
           <w:p>
             <w:pPr>
-              <w:rPr>
-                <w:lang w:val="ru-RU"/>
-              </w:rPr>
-            </w:pPr>
-            <w:r>
-              <w:rPr>
+              <w:jc w:val="center"/>
+              <w:rPr>
+                <w:b/>
+                <w:bCs/>
+                <w:lang w:val="ru-RU"/>
+              </w:rPr>
+            </w:pPr>
+            <w:r>
+              <w:rPr>
+                <w:b/>
+                <w:bCs/>
                 <w:lang w:val="ru-RU"/>
               </w:rPr>
               <w:t>#</w:t>
@@ -2740,12 +3071,17 @@
           </w:tcPr>
           <w:p>
             <w:pPr>
-              <w:rPr>
-                <w:lang w:val="ru-RU"/>
-              </w:rPr>
-            </w:pPr>
-            <w:r>
-              <w:rPr>
+              <w:jc w:val="center"/>
+              <w:rPr>
+                <w:b/>
+                <w:bCs/>
+                <w:lang w:val="ru-RU"/>
+              </w:rPr>
+            </w:pPr>
+            <w:r>
+              <w:rPr>
+                <w:b/>
+                <w:bCs/>
                 <w:lang w:val="ru-RU"/>
               </w:rPr>
               <w:t>Порядковый номер</w:t>
@@ -2906,6 +3242,9 @@
         </w:tc>
       </w:tr>
       <w:tr>
+        <w:trPr>
+          <w:trHeight w:val="269"/>
+        </w:trPr>
         <w:tc>
           <w:tcPr>
             <w:tcW w:w="4672" w:type="dxa"/>
@@ -3015,6 +3354,874 @@
                 <w:lang w:val="ru-RU"/>
               </w:rPr>
               <w:t>Время имеет некорректный формат (ЧЧ:ММ):</w:t>
+            </w:r>
+          </w:p>
+        </w:tc>
+      </w:tr>
+      <w:tr>
+        <w:tc>
+          <w:tcPr>
+            <w:tcW w:w="4672" w:type="dxa"/>
+          </w:tcPr>
+          <w:p>
+            <w:pPr>
+              <w:rPr>
+                <w:lang w:val="ru-RU"/>
+              </w:rPr>
+            </w:pPr>
+            <w:r>
+              <w:rPr>
+                <w:lang w:val="ru-RU"/>
+              </w:rPr>
+              <w:t>Статус теста</w:t>
+            </w:r>
+          </w:p>
+        </w:tc>
+        <w:tc>
+          <w:tcPr>
+            <w:tcW w:w="4673" w:type="dxa"/>
+          </w:tcPr>
+          <w:p>
+            <w:pPr>
+              <w:rPr>
+                <w:lang w:val="ru-RU"/>
+              </w:rPr>
+            </w:pPr>
+            <w:r>
+              <w:rPr>
+                <w:lang w:val="ru-RU"/>
+              </w:rPr>
+              <w:t>П</w:t>
+            </w:r>
+            <w:r>
+              <w:rPr>
+                <w:lang w:val="ru-RU"/>
+              </w:rPr>
+              <w:t>ройден</w:t>
+            </w:r>
+          </w:p>
+        </w:tc>
+      </w:tr>
+    </w:tbl>
+    <w:p>
+      <w:pPr>
+        <w:pStyle w:val="Heading3"/>
+        <w:rPr>
+          <w:lang w:val="ru-RU"/>
+        </w:rPr>
+      </w:pPr>
+      <w:r>
+        <w:rPr>
+          <w:lang w:val="ru-RU"/>
+        </w:rPr>
+        <w:t xml:space="preserve">8 </w:t>
+      </w:r>
+      <w:r>
+        <w:rPr>
+          <w:lang w:val="ru-RU"/>
+        </w:rPr>
+        <w:t>"-1:30"</w:t>
+      </w:r>
+    </w:p>
+    <w:tbl>
+      <w:tblPr>
+        <w:tblStyle w:val="TableGrid"/>
+        <w:tblW w:w="0" w:type="auto"/>
+        <w:tblLook w:val="04A0" w:firstRow="1" w:lastRow="0" w:firstColumn="1" w:lastColumn="0" w:noHBand="0" w:noVBand="1"/>
+      </w:tblPr>
+      <w:tblGrid>
+        <w:gridCol w:w="4672"/>
+        <w:gridCol w:w="4673"/>
+      </w:tblGrid>
+      <w:tr>
+        <w:tc>
+          <w:tcPr>
+            <w:tcW w:w="4672" w:type="dxa"/>
+          </w:tcPr>
+          <w:p>
+            <w:pPr>
+              <w:jc w:val="center"/>
+              <w:rPr>
+                <w:b/>
+                <w:bCs/>
+                <w:lang w:val="ru-RU"/>
+              </w:rPr>
+            </w:pPr>
+            <w:r>
+              <w:rPr>
+                <w:b/>
+                <w:bCs/>
+                <w:lang w:val="ru-RU"/>
+              </w:rPr>
+              <w:t>#</w:t>
+            </w:r>
+          </w:p>
+        </w:tc>
+        <w:tc>
+          <w:tcPr>
+            <w:tcW w:w="4673" w:type="dxa"/>
+          </w:tcPr>
+          <w:p>
+            <w:pPr>
+              <w:jc w:val="center"/>
+              <w:rPr>
+                <w:b/>
+                <w:bCs/>
+                <w:lang w:val="ru-RU"/>
+              </w:rPr>
+            </w:pPr>
+            <w:r>
+              <w:rPr>
+                <w:b/>
+                <w:bCs/>
+                <w:lang w:val="ru-RU"/>
+              </w:rPr>
+              <w:t>Порядковый номер</w:t>
+            </w:r>
+          </w:p>
+        </w:tc>
+      </w:tr>
+      <w:tr>
+        <w:tc>
+          <w:tcPr>
+            <w:tcW w:w="4672" w:type="dxa"/>
+          </w:tcPr>
+          <w:p>
+            <w:pPr>
+              <w:rPr>
+                <w:lang w:val="ru-RU"/>
+              </w:rPr>
+            </w:pPr>
+            <w:r>
+              <w:rPr>
+                <w:lang w:val="ru-RU"/>
+              </w:rPr>
+              <w:t>8</w:t>
+            </w:r>
+          </w:p>
+        </w:tc>
+        <w:tc>
+          <w:tcPr>
+            <w:tcW w:w="4673" w:type="dxa"/>
+          </w:tcPr>
+          <w:p>
+            <w:pPr>
+              <w:rPr>
+                <w:lang w:val="ru-RU"/>
+              </w:rPr>
+            </w:pPr>
+            <w:r>
+              <w:rPr>
+                <w:lang w:val="ru-RU"/>
+              </w:rPr>
+              <w:t>TC</w:t>
+            </w:r>
+            <w:r>
+              <w:rPr>
+                <w:lang w:val="ru-RU"/>
+              </w:rPr>
+              <w:t>8</w:t>
+            </w:r>
+          </w:p>
+        </w:tc>
+      </w:tr>
+      <w:tr>
+        <w:tc>
+          <w:tcPr>
+            <w:tcW w:w="4672" w:type="dxa"/>
+          </w:tcPr>
+          <w:p>
+            <w:pPr>
+              <w:rPr>
+                <w:lang w:val="ru-RU"/>
+              </w:rPr>
+            </w:pPr>
+            <w:r>
+              <w:rPr>
+                <w:lang w:val="ru-RU"/>
+              </w:rPr>
+              <w:t>Название программы</w:t>
+            </w:r>
+          </w:p>
+        </w:tc>
+        <w:tc>
+          <w:tcPr>
+            <w:tcW w:w="4673" w:type="dxa"/>
+          </w:tcPr>
+          <w:p>
+            <w:pPr>
+              <w:rPr>
+                <w:lang w:val="ru-RU"/>
+              </w:rPr>
+            </w:pPr>
+            <w:r>
+              <w:rPr>
+                <w:lang w:val="ru-RU"/>
+              </w:rPr>
+              <w:t>Проверка формата времени "чч:мм"</w:t>
+            </w:r>
+          </w:p>
+        </w:tc>
+      </w:tr>
+      <w:tr>
+        <w:tc>
+          <w:tcPr>
+            <w:tcW w:w="4672" w:type="dxa"/>
+          </w:tcPr>
+          <w:p>
+            <w:pPr>
+              <w:rPr>
+                <w:lang w:val="ru-RU"/>
+              </w:rPr>
+            </w:pPr>
+            <w:r>
+              <w:rPr>
+                <w:lang w:val="ru-RU"/>
+              </w:rPr>
+              <w:t>Резюме тестирования</w:t>
+            </w:r>
+          </w:p>
+        </w:tc>
+        <w:tc>
+          <w:tcPr>
+            <w:tcW w:w="4673" w:type="dxa"/>
+          </w:tcPr>
+          <w:p>
+            <w:pPr>
+              <w:rPr>
+                <w:lang w:val="ru-RU"/>
+              </w:rPr>
+            </w:pPr>
+            <w:r>
+              <w:rPr>
+                <w:lang w:val="ru-RU"/>
+              </w:rPr>
+              <w:t xml:space="preserve">Отрицательное </w:t>
+            </w:r>
+            <w:r>
+              <w:rPr>
+                <w:lang w:val="ru-RU"/>
+              </w:rPr>
+              <w:t>число часов</w:t>
+            </w:r>
+          </w:p>
+        </w:tc>
+      </w:tr>
+      <w:tr>
+        <w:tc>
+          <w:tcPr>
+            <w:tcW w:w="4672" w:type="dxa"/>
+          </w:tcPr>
+          <w:p>
+            <w:pPr>
+              <w:rPr>
+                <w:lang w:val="ru-RU"/>
+              </w:rPr>
+            </w:pPr>
+            <w:r>
+              <w:rPr>
+                <w:lang w:val="ru-RU"/>
+              </w:rPr>
+              <w:t>Вид теста</w:t>
+            </w:r>
+          </w:p>
+        </w:tc>
+        <w:tc>
+          <w:tcPr>
+            <w:tcW w:w="4673" w:type="dxa"/>
+          </w:tcPr>
+          <w:p>
+            <w:pPr>
+              <w:rPr>
+                <w:lang w:val="ru-RU"/>
+              </w:rPr>
+            </w:pPr>
+            <w:r>
+              <w:rPr>
+                <w:lang w:val="ru-RU"/>
+              </w:rPr>
+              <w:t>негативный</w:t>
+            </w:r>
+          </w:p>
+        </w:tc>
+      </w:tr>
+      <w:tr>
+        <w:trPr>
+          <w:trHeight w:val="269"/>
+        </w:trPr>
+        <w:tc>
+          <w:tcPr>
+            <w:tcW w:w="4672" w:type="dxa"/>
+          </w:tcPr>
+          <w:p>
+            <w:pPr>
+              <w:rPr>
+                <w:lang w:val="ru-RU"/>
+              </w:rPr>
+            </w:pPr>
+            <w:r>
+              <w:rPr>
+                <w:lang w:val="ru-RU"/>
+              </w:rPr>
+              <w:t>Тестовые данные</w:t>
+            </w:r>
+          </w:p>
+        </w:tc>
+        <w:tc>
+          <w:tcPr>
+            <w:tcW w:w="4673" w:type="dxa"/>
+          </w:tcPr>
+          <w:p>
+            <w:pPr>
+              <w:rPr>
+                <w:lang w:val="ru-RU"/>
+              </w:rPr>
+            </w:pPr>
+            <w:r>
+              <w:rPr>
+                <w:lang w:val="ru-RU"/>
+              </w:rPr>
+              <w:t>"-1:30"</w:t>
+            </w:r>
+          </w:p>
+        </w:tc>
+      </w:tr>
+      <w:tr>
+        <w:tc>
+          <w:tcPr>
+            <w:tcW w:w="4672" w:type="dxa"/>
+          </w:tcPr>
+          <w:p>
+            <w:pPr>
+              <w:rPr>
+                <w:lang w:val="ru-RU"/>
+              </w:rPr>
+            </w:pPr>
+            <w:r>
+              <w:rPr>
+                <w:lang w:val="ru-RU"/>
+              </w:rPr>
+              <w:t>Ожидаемый результат</w:t>
+            </w:r>
+          </w:p>
+        </w:tc>
+        <w:tc>
+          <w:tcPr>
+            <w:tcW w:w="4673" w:type="dxa"/>
+          </w:tcPr>
+          <w:p>
+            <w:pPr>
+              <w:rPr>
+                <w:lang w:val="ru-RU"/>
+              </w:rPr>
+            </w:pPr>
+            <w:r>
+              <w:rPr>
+                <w:lang w:val="ru-RU"/>
+              </w:rPr>
+              <w:t xml:space="preserve">Время имеет некорректный формат (ЧЧ:ММ): </w:t>
+            </w:r>
+            <w:r>
+              <w:rPr>
+                <w:lang w:val="ru-RU"/>
+              </w:rPr>
+              <w:t>-1:30</w:t>
+            </w:r>
+          </w:p>
+        </w:tc>
+      </w:tr>
+      <w:tr>
+        <w:tc>
+          <w:tcPr>
+            <w:tcW w:w="4672" w:type="dxa"/>
+          </w:tcPr>
+          <w:p>
+            <w:pPr>
+              <w:rPr>
+                <w:lang w:val="ru-RU"/>
+              </w:rPr>
+            </w:pPr>
+            <w:r>
+              <w:rPr>
+                <w:lang w:val="ru-RU"/>
+              </w:rPr>
+              <w:t>Полученный результат</w:t>
+            </w:r>
+          </w:p>
+        </w:tc>
+        <w:tc>
+          <w:tcPr>
+            <w:tcW w:w="4673" w:type="dxa"/>
+          </w:tcPr>
+          <w:p>
+            <w:pPr>
+              <w:rPr>
+                <w:lang w:val="ru-RU"/>
+              </w:rPr>
+            </w:pPr>
+            <w:r>
+              <w:rPr>
+                <w:lang w:val="ru-RU"/>
+              </w:rPr>
+              <w:t>Время имеет некорректный формат (ЧЧ:ММ):</w:t>
+            </w:r>
+            <w:r>
+              <w:rPr>
+                <w:lang w:val="ru-RU"/>
+              </w:rPr>
+              <w:t xml:space="preserve"> </w:t>
+            </w:r>
+            <w:r>
+              <w:rPr>
+                <w:lang w:val="ru-RU"/>
+              </w:rPr>
+              <w:t>-1:30</w:t>
+            </w:r>
+          </w:p>
+        </w:tc>
+      </w:tr>
+      <w:tr>
+        <w:tc>
+          <w:tcPr>
+            <w:tcW w:w="4672" w:type="dxa"/>
+          </w:tcPr>
+          <w:p>
+            <w:pPr>
+              <w:rPr>
+                <w:lang w:val="ru-RU"/>
+              </w:rPr>
+            </w:pPr>
+            <w:r>
+              <w:rPr>
+                <w:lang w:val="ru-RU"/>
+              </w:rPr>
+              <w:t>Статус теста</w:t>
+            </w:r>
+          </w:p>
+        </w:tc>
+        <w:tc>
+          <w:tcPr>
+            <w:tcW w:w="4673" w:type="dxa"/>
+          </w:tcPr>
+          <w:p>
+            <w:pPr>
+              <w:rPr>
+                <w:lang w:val="ru-RU"/>
+              </w:rPr>
+            </w:pPr>
+            <w:r>
+              <w:rPr>
+                <w:lang w:val="ru-RU"/>
+              </w:rPr>
+              <w:t>П</w:t>
+            </w:r>
+            <w:r>
+              <w:rPr>
+                <w:lang w:val="ru-RU"/>
+              </w:rPr>
+              <w:t>ройден</w:t>
+            </w:r>
+          </w:p>
+        </w:tc>
+      </w:tr>
+    </w:tbl>
+    <w:p>
+      <w:pPr>
+        <w:pStyle w:val="Heading3"/>
+        <w:rPr>
+          <w:lang w:val="ru-RU"/>
+        </w:rPr>
+      </w:pPr>
+      <w:r>
+        <w:rPr>
+          <w:lang w:val="ru-RU"/>
+        </w:rPr>
+        <w:t>9</w:t>
+      </w:r>
+      <w:r>
+        <w:rPr>
+          <w:lang w:val="ru-RU"/>
+        </w:rPr>
+        <w:t xml:space="preserve"> </w:t>
+      </w:r>
+      <w:r>
+        <w:rPr>
+          <w:lang w:val="ru-RU"/>
+        </w:rPr>
+        <w:t>"</w:t>
+      </w:r>
+      <w:r>
+        <w:rPr>
+          <w:lang w:val="ru-RU"/>
+        </w:rPr>
+        <w:t>ab:cd</w:t>
+      </w:r>
+      <w:r>
+        <w:rPr>
+          <w:lang w:val="ru-RU"/>
+        </w:rPr>
+        <w:t>"</w:t>
+      </w:r>
+    </w:p>
+    <w:tbl>
+      <w:tblPr>
+        <w:tblStyle w:val="TableGrid"/>
+        <w:tblW w:w="0" w:type="auto"/>
+        <w:tblLook w:val="04A0" w:firstRow="1" w:lastRow="0" w:firstColumn="1" w:lastColumn="0" w:noHBand="0" w:noVBand="1"/>
+      </w:tblPr>
+      <w:tblGrid>
+        <w:gridCol w:w="4672"/>
+        <w:gridCol w:w="4673"/>
+      </w:tblGrid>
+      <w:tr>
+        <w:tc>
+          <w:tcPr>
+            <w:tcW w:w="4672" w:type="dxa"/>
+          </w:tcPr>
+          <w:p>
+            <w:pPr>
+              <w:jc w:val="center"/>
+              <w:rPr>
+                <w:b/>
+                <w:bCs/>
+                <w:lang w:val="ru-RU"/>
+              </w:rPr>
+            </w:pPr>
+            <w:r>
+              <w:rPr>
+                <w:b/>
+                <w:bCs/>
+                <w:lang w:val="ru-RU"/>
+              </w:rPr>
+              <w:t>#</w:t>
+            </w:r>
+          </w:p>
+        </w:tc>
+        <w:tc>
+          <w:tcPr>
+            <w:tcW w:w="4673" w:type="dxa"/>
+          </w:tcPr>
+          <w:p>
+            <w:pPr>
+              <w:jc w:val="center"/>
+              <w:rPr>
+                <w:b/>
+                <w:bCs/>
+                <w:lang w:val="ru-RU"/>
+              </w:rPr>
+            </w:pPr>
+            <w:r>
+              <w:rPr>
+                <w:b/>
+                <w:bCs/>
+                <w:lang w:val="ru-RU"/>
+              </w:rPr>
+              <w:t>Порядковый номер</w:t>
+            </w:r>
+          </w:p>
+        </w:tc>
+      </w:tr>
+      <w:tr>
+        <w:tc>
+          <w:tcPr>
+            <w:tcW w:w="4672" w:type="dxa"/>
+          </w:tcPr>
+          <w:p>
+            <w:pPr>
+              <w:rPr>
+                <w:lang w:val="ru-RU"/>
+              </w:rPr>
+            </w:pPr>
+            <w:r>
+              <w:rPr>
+                <w:lang w:val="ru-RU"/>
+              </w:rPr>
+              <w:t>8</w:t>
+            </w:r>
+          </w:p>
+        </w:tc>
+        <w:tc>
+          <w:tcPr>
+            <w:tcW w:w="4673" w:type="dxa"/>
+          </w:tcPr>
+          <w:p>
+            <w:pPr>
+              <w:rPr>
+                <w:lang w:val="ru-RU"/>
+              </w:rPr>
+            </w:pPr>
+            <w:r>
+              <w:rPr>
+                <w:lang w:val="ru-RU"/>
+              </w:rPr>
+              <w:t>TC</w:t>
+            </w:r>
+            <w:r>
+              <w:rPr>
+                <w:lang w:val="ru-RU"/>
+              </w:rPr>
+              <w:t>8</w:t>
+            </w:r>
+          </w:p>
+        </w:tc>
+      </w:tr>
+      <w:tr>
+        <w:tc>
+          <w:tcPr>
+            <w:tcW w:w="4672" w:type="dxa"/>
+          </w:tcPr>
+          <w:p>
+            <w:pPr>
+              <w:rPr>
+                <w:lang w:val="ru-RU"/>
+              </w:rPr>
+            </w:pPr>
+            <w:r>
+              <w:rPr>
+                <w:lang w:val="ru-RU"/>
+              </w:rPr>
+              <w:t>Название программы</w:t>
+            </w:r>
+          </w:p>
+        </w:tc>
+        <w:tc>
+          <w:tcPr>
+            <w:tcW w:w="4673" w:type="dxa"/>
+          </w:tcPr>
+          <w:p>
+            <w:pPr>
+              <w:rPr>
+                <w:lang w:val="ru-RU"/>
+              </w:rPr>
+            </w:pPr>
+            <w:r>
+              <w:rPr>
+                <w:lang w:val="ru-RU"/>
+              </w:rPr>
+              <w:t>Проверка формата времени "чч:мм"</w:t>
+            </w:r>
+          </w:p>
+        </w:tc>
+      </w:tr>
+      <w:tr>
+        <w:tc>
+          <w:tcPr>
+            <w:tcW w:w="4672" w:type="dxa"/>
+          </w:tcPr>
+          <w:p>
+            <w:pPr>
+              <w:rPr>
+                <w:lang w:val="ru-RU"/>
+              </w:rPr>
+            </w:pPr>
+            <w:r>
+              <w:rPr>
+                <w:lang w:val="ru-RU"/>
+              </w:rPr>
+              <w:t>Резюме тестирования</w:t>
+            </w:r>
+          </w:p>
+        </w:tc>
+        <w:tc>
+          <w:tcPr>
+            <w:tcW w:w="4673" w:type="dxa"/>
+          </w:tcPr>
+          <w:p>
+            <w:pPr>
+              <w:rPr>
+                <w:lang w:val="ru-RU"/>
+              </w:rPr>
+            </w:pPr>
+            <w:r>
+              <w:rPr>
+                <w:lang w:val="ru-RU"/>
+              </w:rPr>
+              <w:t>Не числовое значение вместо цифр</w:t>
+            </w:r>
+          </w:p>
+        </w:tc>
+      </w:tr>
+      <w:tr>
+        <w:tc>
+          <w:tcPr>
+            <w:tcW w:w="4672" w:type="dxa"/>
+          </w:tcPr>
+          <w:p>
+            <w:pPr>
+              <w:rPr>
+                <w:lang w:val="ru-RU"/>
+              </w:rPr>
+            </w:pPr>
+            <w:r>
+              <w:rPr>
+                <w:lang w:val="ru-RU"/>
+              </w:rPr>
+              <w:t>Вид теста</w:t>
+            </w:r>
+          </w:p>
+        </w:tc>
+        <w:tc>
+          <w:tcPr>
+            <w:tcW w:w="4673" w:type="dxa"/>
+          </w:tcPr>
+          <w:p>
+            <w:pPr>
+              <w:rPr>
+                <w:lang w:val="ru-RU"/>
+              </w:rPr>
+            </w:pPr>
+            <w:r>
+              <w:rPr>
+                <w:lang w:val="ru-RU"/>
+              </w:rPr>
+              <w:t>негативный</w:t>
+            </w:r>
+          </w:p>
+        </w:tc>
+      </w:tr>
+      <w:tr>
+        <w:trPr>
+          <w:trHeight w:val="269"/>
+        </w:trPr>
+        <w:tc>
+          <w:tcPr>
+            <w:tcW w:w="4672" w:type="dxa"/>
+          </w:tcPr>
+          <w:p>
+            <w:pPr>
+              <w:rPr>
+                <w:lang w:val="ru-RU"/>
+              </w:rPr>
+            </w:pPr>
+            <w:r>
+              <w:rPr>
+                <w:lang w:val="ru-RU"/>
+              </w:rPr>
+              <w:t>Тестовые данные</w:t>
+            </w:r>
+          </w:p>
+        </w:tc>
+        <w:tc>
+          <w:tcPr>
+            <w:tcW w:w="4673" w:type="dxa"/>
+          </w:tcPr>
+          <w:p>
+            <w:pPr>
+              <w:rPr>
+                <w:lang w:val="ru-RU"/>
+              </w:rPr>
+            </w:pPr>
+            <w:r>
+              <w:rPr>
+                <w:lang w:val="en-US"/>
+              </w:rPr>
+              <w:t>“</w:t>
+            </w:r>
+            <w:r>
+              <w:rPr>
+                <w:lang w:val="ru-RU"/>
+              </w:rPr>
+              <w:t>ab:cd</w:t>
+            </w:r>
+            <w:r>
+              <w:rPr>
+                <w:lang w:val="ru-RU"/>
+              </w:rPr>
+              <w:t>"</w:t>
+            </w:r>
+          </w:p>
+        </w:tc>
+      </w:tr>
+      <w:tr>
+        <w:tc>
+          <w:tcPr>
+            <w:tcW w:w="4672" w:type="dxa"/>
+          </w:tcPr>
+          <w:p>
+            <w:pPr>
+              <w:rPr>
+                <w:lang w:val="ru-RU"/>
+              </w:rPr>
+            </w:pPr>
+            <w:r>
+              <w:rPr>
+                <w:lang w:val="ru-RU"/>
+              </w:rPr>
+              <w:t>Ожидаемый результат</w:t>
+            </w:r>
+          </w:p>
+        </w:tc>
+        <w:tc>
+          <w:tcPr>
+            <w:tcW w:w="4673" w:type="dxa"/>
+          </w:tcPr>
+          <w:p>
+            <w:pPr>
+              <w:rPr>
+                <w:lang w:val="ru-RU"/>
+              </w:rPr>
+            </w:pPr>
+            <w:r>
+              <w:rPr>
+                <w:lang w:val="ru-RU"/>
+              </w:rPr>
+              <w:t xml:space="preserve">Время имеет некорректный формат (ЧЧ:ММ): </w:t>
+            </w:r>
+            <w:r>
+              <w:rPr>
+                <w:lang w:val="ru-RU"/>
+              </w:rPr>
+              <w:t>ab:cd</w:t>
+            </w:r>
+          </w:p>
+        </w:tc>
+      </w:tr>
+      <w:tr>
+        <w:tc>
+          <w:tcPr>
+            <w:tcW w:w="4672" w:type="dxa"/>
+          </w:tcPr>
+          <w:p>
+            <w:pPr>
+              <w:rPr>
+                <w:lang w:val="ru-RU"/>
+              </w:rPr>
+            </w:pPr>
+            <w:r>
+              <w:rPr>
+                <w:lang w:val="ru-RU"/>
+              </w:rPr>
+              <w:t>Полученный результат</w:t>
+            </w:r>
+          </w:p>
+        </w:tc>
+        <w:tc>
+          <w:tcPr>
+            <w:tcW w:w="4673" w:type="dxa"/>
+          </w:tcPr>
+          <w:p>
+            <w:pPr>
+              <w:rPr>
+                <w:lang w:val="ru-RU"/>
+              </w:rPr>
+            </w:pPr>
+            <w:r>
+              <w:rPr>
+                <w:lang w:val="ru-RU"/>
+              </w:rPr>
+              <w:t>Время имеет некорректный формат (ЧЧ:ММ):</w:t>
+            </w:r>
+            <w:r>
+              <w:rPr>
+                <w:lang w:val="ru-RU"/>
+              </w:rPr>
+              <w:t xml:space="preserve"> </w:t>
+            </w:r>
+            <w:r>
+              <w:rPr>
+                <w:lang w:val="ru-RU"/>
+              </w:rPr>
+              <w:t>ab:cd</w:t>
             </w:r>
           </w:p>
         </w:tc>
@@ -3557,7 +4764,6 @@
     <w:next w:val="Normal"/>
     <w:link w:val="Heading4Char"/>
     <w:uiPriority w:val="9"/>
-    <w:semiHidden/>
     <w:unhideWhenUsed/>
     <w:qFormat/>
     <w:rsid w:val="00333693"/>
@@ -3686,6 +4892,7 @@
   <w:style w:type="character" w:default="1" w:styleId="DefaultParagraphFont">
     <w:name w:val="Default Paragraph Font"/>
     <w:uiPriority w:val="1"/>
+    <w:semiHidden/>
     <w:unhideWhenUsed/>
   </w:style>
   <w:style w:type="table" w:default="1" w:styleId="TableNormal">
@@ -3753,7 +4960,6 @@
     <w:basedOn w:val="DefaultParagraphFont"/>
     <w:link w:val="Heading4"/>
     <w:uiPriority w:val="9"/>
-    <w:semiHidden/>
     <w:rsid w:val="00333693"/>
     <w:rPr>
       <w:rFonts w:eastAsiaTheme="majorEastAsia" w:cstheme="majorBidi"/>

</xml_diff>